<commit_message>
Modifiche project plan e specifica dei requisiti
Modificato stile file e aggiunto elementi secondari al project plan + copertina.
</commit_message>
<xml_diff>
--- a/documentazione/Specifica dei requisiti.docx
+++ b/documentazione/Specifica dei requisiti.docx
@@ -28,19 +28,8 @@
           <w:sz w:val="28"/>
           <w:szCs w:val="28"/>
         </w:rPr>
-        <w:t xml:space="preserve">Requisiti Software – </w:t>
+        <w:t>Requisiti Software – Find&amp;Charge</w:t>
       </w:r>
-      <w:proofErr w:type="spellStart"/>
-      <w:r>
-        <w:rPr>
-          <w:b/>
-          <w:bCs/>
-          <w:sz w:val="28"/>
-          <w:szCs w:val="28"/>
-        </w:rPr>
-        <w:t>Find&amp;Charge</w:t>
-      </w:r>
-      <w:proofErr w:type="spellEnd"/>
     </w:p>
     <w:p>
       <w:pPr>
@@ -132,13 +121,8 @@
               <w:jc w:val="center"/>
             </w:pPr>
             <w:r>
-              <w:t xml:space="preserve">Priorità </w:t>
-            </w:r>
-            <w:proofErr w:type="spellStart"/>
-            <w:r>
-              <w:t>MoSCoW</w:t>
-            </w:r>
-            <w:proofErr w:type="spellEnd"/>
+              <w:t>Priorità MoSCoW</w:t>
+            </w:r>
           </w:p>
         </w:tc>
         <w:tc>
@@ -677,38 +661,33 @@
               <w:spacing w:before="120" w:after="120"/>
             </w:pPr>
             <w:r>
-              <w:t>Ricerca e Filtri</w:t>
-            </w:r>
-          </w:p>
-        </w:tc>
-        <w:tc>
-          <w:tcPr>
-            <w:tcW w:w="0" w:type="auto"/>
-            <w:vAlign w:val="center"/>
-          </w:tcPr>
-          <w:p>
-            <w:pPr>
-              <w:spacing w:before="120" w:after="120"/>
-            </w:pPr>
-            <w:r>
-              <w:t>Consente di cercare le colonnine per nome, indirizzo e comune.</w:t>
-            </w:r>
-          </w:p>
-        </w:tc>
-        <w:tc>
-          <w:tcPr>
-            <w:tcW w:w="0" w:type="auto"/>
-            <w:vAlign w:val="center"/>
-          </w:tcPr>
-          <w:p>
-            <w:pPr>
-              <w:spacing w:before="120" w:after="120"/>
-            </w:pPr>
-            <w:proofErr w:type="spellStart"/>
-            <w:r>
-              <w:t>Could</w:t>
-            </w:r>
-            <w:proofErr w:type="spellEnd"/>
+              <w:t>Gestione auto utente</w:t>
+            </w:r>
+          </w:p>
+        </w:tc>
+        <w:tc>
+          <w:tcPr>
+            <w:tcW w:w="0" w:type="auto"/>
+            <w:vAlign w:val="center"/>
+          </w:tcPr>
+          <w:p>
+            <w:pPr>
+              <w:spacing w:before="120" w:after="120"/>
+            </w:pPr>
+            <w:r>
+              <w:t>Permette all’utente di aggiungere le sue auto al sistema e vedere la loro carica.</w:t>
+            </w:r>
+          </w:p>
+        </w:tc>
+        <w:tc>
+          <w:tcPr>
+            <w:tcW w:w="0" w:type="auto"/>
+            <w:vAlign w:val="center"/>
+          </w:tcPr>
+          <w:p>
+            <w:pPr>
+              <w:spacing w:before="120" w:after="120"/>
+            </w:pPr>
           </w:p>
         </w:tc>
         <w:tc>
@@ -734,52 +713,53 @@
               <w:spacing w:before="120" w:after="120"/>
             </w:pPr>
             <w:r>
-              <w:t>RF09</w:t>
-            </w:r>
-          </w:p>
-        </w:tc>
-        <w:tc>
-          <w:tcPr>
-            <w:tcW w:w="0" w:type="auto"/>
-            <w:vAlign w:val="center"/>
-          </w:tcPr>
-          <w:p>
-            <w:pPr>
-              <w:spacing w:before="120" w:after="120"/>
-            </w:pPr>
-            <w:r>
-              <w:t>Notifiche</w:t>
-            </w:r>
-          </w:p>
-        </w:tc>
-        <w:tc>
-          <w:tcPr>
-            <w:tcW w:w="0" w:type="auto"/>
-            <w:vAlign w:val="center"/>
-          </w:tcPr>
-          <w:p>
-            <w:pPr>
-              <w:spacing w:before="120" w:after="120"/>
-            </w:pPr>
-            <w:r>
-              <w:t>Invia notifiche di promemoria della prenotazione.</w:t>
-            </w:r>
-          </w:p>
-        </w:tc>
-        <w:tc>
-          <w:tcPr>
-            <w:tcW w:w="0" w:type="auto"/>
-            <w:vAlign w:val="center"/>
-          </w:tcPr>
-          <w:p>
-            <w:pPr>
-              <w:spacing w:before="120" w:after="120"/>
-            </w:pPr>
-            <w:proofErr w:type="spellStart"/>
+              <w:t>RF0</w:t>
+            </w:r>
+            <w:r>
+              <w:t>9</w:t>
+            </w:r>
+          </w:p>
+        </w:tc>
+        <w:tc>
+          <w:tcPr>
+            <w:tcW w:w="0" w:type="auto"/>
+            <w:vAlign w:val="center"/>
+          </w:tcPr>
+          <w:p>
+            <w:pPr>
+              <w:spacing w:before="120" w:after="120"/>
+            </w:pPr>
+            <w:r>
+              <w:t>Ricerca e Filtri</w:t>
+            </w:r>
+          </w:p>
+        </w:tc>
+        <w:tc>
+          <w:tcPr>
+            <w:tcW w:w="0" w:type="auto"/>
+            <w:vAlign w:val="center"/>
+          </w:tcPr>
+          <w:p>
+            <w:pPr>
+              <w:spacing w:before="120" w:after="120"/>
+            </w:pPr>
+            <w:r>
+              <w:t>Consente di cercare le colonnine per nome, indirizzo e comune.</w:t>
+            </w:r>
+          </w:p>
+        </w:tc>
+        <w:tc>
+          <w:tcPr>
+            <w:tcW w:w="0" w:type="auto"/>
+            <w:vAlign w:val="center"/>
+          </w:tcPr>
+          <w:p>
+            <w:pPr>
+              <w:spacing w:before="120" w:after="120"/>
+            </w:pPr>
             <w:r>
               <w:t>Could</w:t>
             </w:r>
-            <w:proofErr w:type="spellEnd"/>
           </w:p>
         </w:tc>
         <w:tc>
@@ -805,52 +785,53 @@
               <w:spacing w:before="120" w:after="120"/>
             </w:pPr>
             <w:r>
-              <w:t>RF10</w:t>
-            </w:r>
-          </w:p>
-        </w:tc>
-        <w:tc>
-          <w:tcPr>
-            <w:tcW w:w="0" w:type="auto"/>
-            <w:vAlign w:val="center"/>
-          </w:tcPr>
-          <w:p>
-            <w:pPr>
-              <w:spacing w:before="120" w:after="120"/>
-            </w:pPr>
-            <w:r>
-              <w:t>Valutazione e Feedback</w:t>
-            </w:r>
-          </w:p>
-        </w:tc>
-        <w:tc>
-          <w:tcPr>
-            <w:tcW w:w="0" w:type="auto"/>
-            <w:vAlign w:val="center"/>
-          </w:tcPr>
-          <w:p>
-            <w:pPr>
-              <w:spacing w:before="120" w:after="120"/>
-            </w:pPr>
-            <w:r>
-              <w:t>Permette di recensire tramite un voto da 1 a 5 le colonnine. È possibile anche indicare se sono guaste.</w:t>
-            </w:r>
-          </w:p>
-        </w:tc>
-        <w:tc>
-          <w:tcPr>
-            <w:tcW w:w="0" w:type="auto"/>
-            <w:vAlign w:val="center"/>
-          </w:tcPr>
-          <w:p>
-            <w:pPr>
-              <w:spacing w:before="120" w:after="120"/>
-            </w:pPr>
-            <w:proofErr w:type="spellStart"/>
+              <w:t>RF</w:t>
+            </w:r>
+            <w:r>
+              <w:t>10</w:t>
+            </w:r>
+          </w:p>
+        </w:tc>
+        <w:tc>
+          <w:tcPr>
+            <w:tcW w:w="0" w:type="auto"/>
+            <w:vAlign w:val="center"/>
+          </w:tcPr>
+          <w:p>
+            <w:pPr>
+              <w:spacing w:before="120" w:after="120"/>
+            </w:pPr>
+            <w:r>
+              <w:t>Notifiche</w:t>
+            </w:r>
+          </w:p>
+        </w:tc>
+        <w:tc>
+          <w:tcPr>
+            <w:tcW w:w="0" w:type="auto"/>
+            <w:vAlign w:val="center"/>
+          </w:tcPr>
+          <w:p>
+            <w:pPr>
+              <w:spacing w:before="120" w:after="120"/>
+            </w:pPr>
+            <w:r>
+              <w:t>Invia notifiche di promemoria della prenotazione.</w:t>
+            </w:r>
+          </w:p>
+        </w:tc>
+        <w:tc>
+          <w:tcPr>
+            <w:tcW w:w="0" w:type="auto"/>
+            <w:vAlign w:val="center"/>
+          </w:tcPr>
+          <w:p>
+            <w:pPr>
+              <w:spacing w:before="120" w:after="120"/>
+            </w:pPr>
             <w:r>
               <w:t>Could</w:t>
             </w:r>
-            <w:proofErr w:type="spellEnd"/>
           </w:p>
         </w:tc>
         <w:tc>
@@ -876,52 +857,53 @@
               <w:spacing w:before="120" w:after="120"/>
             </w:pPr>
             <w:r>
-              <w:t>RF11</w:t>
-            </w:r>
-          </w:p>
-        </w:tc>
-        <w:tc>
-          <w:tcPr>
-            <w:tcW w:w="0" w:type="auto"/>
-            <w:vAlign w:val="center"/>
-          </w:tcPr>
-          <w:p>
-            <w:pPr>
-              <w:spacing w:before="120" w:after="120"/>
-            </w:pPr>
-            <w:r>
-              <w:t>Geolocalizzazione</w:t>
-            </w:r>
-          </w:p>
-        </w:tc>
-        <w:tc>
-          <w:tcPr>
-            <w:tcW w:w="0" w:type="auto"/>
-            <w:vAlign w:val="center"/>
-          </w:tcPr>
-          <w:p>
-            <w:pPr>
-              <w:spacing w:before="120" w:after="120"/>
-            </w:pPr>
-            <w:r>
-              <w:t>Mostra la mappa centrata sulla posizione attuale dell’utente.</w:t>
-            </w:r>
-          </w:p>
-        </w:tc>
-        <w:tc>
-          <w:tcPr>
-            <w:tcW w:w="0" w:type="auto"/>
-            <w:vAlign w:val="center"/>
-          </w:tcPr>
-          <w:p>
-            <w:pPr>
-              <w:spacing w:before="120" w:after="120"/>
-            </w:pPr>
-            <w:proofErr w:type="spellStart"/>
+              <w:t>RF</w:t>
+            </w:r>
+            <w:r>
+              <w:t>11</w:t>
+            </w:r>
+          </w:p>
+        </w:tc>
+        <w:tc>
+          <w:tcPr>
+            <w:tcW w:w="0" w:type="auto"/>
+            <w:vAlign w:val="center"/>
+          </w:tcPr>
+          <w:p>
+            <w:pPr>
+              <w:spacing w:before="120" w:after="120"/>
+            </w:pPr>
+            <w:r>
+              <w:t>Valutazione e Feedback</w:t>
+            </w:r>
+          </w:p>
+        </w:tc>
+        <w:tc>
+          <w:tcPr>
+            <w:tcW w:w="0" w:type="auto"/>
+            <w:vAlign w:val="center"/>
+          </w:tcPr>
+          <w:p>
+            <w:pPr>
+              <w:spacing w:before="120" w:after="120"/>
+            </w:pPr>
+            <w:r>
+              <w:t>Permette di recensire tramite un voto da 1 a 5 le colonnine. È possibile anche indicare se sono guaste.</w:t>
+            </w:r>
+          </w:p>
+        </w:tc>
+        <w:tc>
+          <w:tcPr>
+            <w:tcW w:w="0" w:type="auto"/>
+            <w:vAlign w:val="center"/>
+          </w:tcPr>
+          <w:p>
+            <w:pPr>
+              <w:spacing w:before="120" w:after="120"/>
+            </w:pPr>
             <w:r>
               <w:t>Could</w:t>
             </w:r>
-            <w:proofErr w:type="spellEnd"/>
           </w:p>
         </w:tc>
         <w:tc>
@@ -947,52 +929,53 @@
               <w:spacing w:before="120" w:after="120"/>
             </w:pPr>
             <w:r>
-              <w:t>RF12</w:t>
-            </w:r>
-          </w:p>
-        </w:tc>
-        <w:tc>
-          <w:tcPr>
-            <w:tcW w:w="0" w:type="auto"/>
-            <w:vAlign w:val="center"/>
-          </w:tcPr>
-          <w:p>
-            <w:pPr>
-              <w:spacing w:before="120" w:after="120"/>
-            </w:pPr>
-            <w:r>
-              <w:t>Recupero Password</w:t>
-            </w:r>
-          </w:p>
-        </w:tc>
-        <w:tc>
-          <w:tcPr>
-            <w:tcW w:w="0" w:type="auto"/>
-            <w:vAlign w:val="center"/>
-          </w:tcPr>
-          <w:p>
-            <w:pPr>
-              <w:spacing w:before="120" w:after="120"/>
-            </w:pPr>
-            <w:r>
-              <w:t>Permette di recuperare la password dimenticata tramite mail.</w:t>
-            </w:r>
-          </w:p>
-        </w:tc>
-        <w:tc>
-          <w:tcPr>
-            <w:tcW w:w="0" w:type="auto"/>
-            <w:vAlign w:val="center"/>
-          </w:tcPr>
-          <w:p>
-            <w:pPr>
-              <w:spacing w:before="120" w:after="120"/>
-            </w:pPr>
-            <w:proofErr w:type="spellStart"/>
-            <w:r>
-              <w:t>Won’t</w:t>
-            </w:r>
-            <w:proofErr w:type="spellEnd"/>
+              <w:t>RF1</w:t>
+            </w:r>
+            <w:r>
+              <w:t>2</w:t>
+            </w:r>
+          </w:p>
+        </w:tc>
+        <w:tc>
+          <w:tcPr>
+            <w:tcW w:w="0" w:type="auto"/>
+            <w:vAlign w:val="center"/>
+          </w:tcPr>
+          <w:p>
+            <w:pPr>
+              <w:spacing w:before="120" w:after="120"/>
+            </w:pPr>
+            <w:r>
+              <w:t>Geolocalizzazione</w:t>
+            </w:r>
+          </w:p>
+        </w:tc>
+        <w:tc>
+          <w:tcPr>
+            <w:tcW w:w="0" w:type="auto"/>
+            <w:vAlign w:val="center"/>
+          </w:tcPr>
+          <w:p>
+            <w:pPr>
+              <w:spacing w:before="120" w:after="120"/>
+            </w:pPr>
+            <w:r>
+              <w:t>Mostra la mappa centrata sulla posizione attuale dell’utente.</w:t>
+            </w:r>
+          </w:p>
+        </w:tc>
+        <w:tc>
+          <w:tcPr>
+            <w:tcW w:w="0" w:type="auto"/>
+            <w:vAlign w:val="center"/>
+          </w:tcPr>
+          <w:p>
+            <w:pPr>
+              <w:spacing w:before="120" w:after="120"/>
+            </w:pPr>
+            <w:r>
+              <w:t>Could</w:t>
+            </w:r>
           </w:p>
         </w:tc>
         <w:tc>
@@ -1018,58 +1001,53 @@
               <w:spacing w:before="120" w:after="120"/>
             </w:pPr>
             <w:r>
-              <w:t>RF13</w:t>
-            </w:r>
-          </w:p>
-        </w:tc>
-        <w:tc>
-          <w:tcPr>
-            <w:tcW w:w="0" w:type="auto"/>
-            <w:vAlign w:val="center"/>
-          </w:tcPr>
-          <w:p>
-            <w:pPr>
-              <w:spacing w:before="120" w:after="120"/>
-            </w:pPr>
-            <w:r>
-              <w:t>Conferma Accou</w:t>
-            </w:r>
-            <w:r>
-              <w:t>n</w:t>
-            </w:r>
-            <w:r>
-              <w:t>t</w:t>
-            </w:r>
-          </w:p>
-        </w:tc>
-        <w:tc>
-          <w:tcPr>
-            <w:tcW w:w="0" w:type="auto"/>
-            <w:vAlign w:val="center"/>
-          </w:tcPr>
-          <w:p>
-            <w:pPr>
-              <w:spacing w:before="120" w:after="120"/>
-            </w:pPr>
-            <w:r>
-              <w:t>Invia una mail di conferma all’utente dopo che si è registrato.</w:t>
-            </w:r>
-          </w:p>
-        </w:tc>
-        <w:tc>
-          <w:tcPr>
-            <w:tcW w:w="0" w:type="auto"/>
-            <w:vAlign w:val="center"/>
-          </w:tcPr>
-          <w:p>
-            <w:pPr>
-              <w:spacing w:before="120" w:after="120"/>
-            </w:pPr>
-            <w:proofErr w:type="spellStart"/>
+              <w:t>RF1</w:t>
+            </w:r>
+            <w:r>
+              <w:t>3</w:t>
+            </w:r>
+          </w:p>
+        </w:tc>
+        <w:tc>
+          <w:tcPr>
+            <w:tcW w:w="0" w:type="auto"/>
+            <w:vAlign w:val="center"/>
+          </w:tcPr>
+          <w:p>
+            <w:pPr>
+              <w:spacing w:before="120" w:after="120"/>
+            </w:pPr>
+            <w:r>
+              <w:t>Recupero Password</w:t>
+            </w:r>
+          </w:p>
+        </w:tc>
+        <w:tc>
+          <w:tcPr>
+            <w:tcW w:w="0" w:type="auto"/>
+            <w:vAlign w:val="center"/>
+          </w:tcPr>
+          <w:p>
+            <w:pPr>
+              <w:spacing w:before="120" w:after="120"/>
+            </w:pPr>
+            <w:r>
+              <w:t>Permette di recuperare la password dimenticata tramite mail.</w:t>
+            </w:r>
+          </w:p>
+        </w:tc>
+        <w:tc>
+          <w:tcPr>
+            <w:tcW w:w="0" w:type="auto"/>
+            <w:vAlign w:val="center"/>
+          </w:tcPr>
+          <w:p>
+            <w:pPr>
+              <w:spacing w:before="120" w:after="120"/>
+            </w:pPr>
             <w:r>
               <w:t>Won’t</w:t>
             </w:r>
-            <w:proofErr w:type="spellEnd"/>
           </w:p>
         </w:tc>
         <w:tc>
@@ -1096,52 +1074,59 @@
             </w:pPr>
             <w:r>
               <w:lastRenderedPageBreak/>
-              <w:t>RF14</w:t>
-            </w:r>
-          </w:p>
-        </w:tc>
-        <w:tc>
-          <w:tcPr>
-            <w:tcW w:w="0" w:type="auto"/>
-            <w:vAlign w:val="center"/>
-          </w:tcPr>
-          <w:p>
-            <w:pPr>
-              <w:spacing w:before="120" w:after="120"/>
-            </w:pPr>
-            <w:r>
-              <w:t>Pagamento</w:t>
-            </w:r>
-          </w:p>
-        </w:tc>
-        <w:tc>
-          <w:tcPr>
-            <w:tcW w:w="0" w:type="auto"/>
-            <w:vAlign w:val="center"/>
-          </w:tcPr>
-          <w:p>
-            <w:pPr>
-              <w:spacing w:before="120" w:after="120"/>
-            </w:pPr>
-            <w:r>
-              <w:t>Permette il pagamento online del servizio.</w:t>
-            </w:r>
-          </w:p>
-        </w:tc>
-        <w:tc>
-          <w:tcPr>
-            <w:tcW w:w="0" w:type="auto"/>
-            <w:vAlign w:val="center"/>
-          </w:tcPr>
-          <w:p>
-            <w:pPr>
-              <w:spacing w:before="120" w:after="120"/>
-            </w:pPr>
-            <w:proofErr w:type="spellStart"/>
+              <w:t>RF1</w:t>
+            </w:r>
+            <w:r>
+              <w:t>4</w:t>
+            </w:r>
+          </w:p>
+        </w:tc>
+        <w:tc>
+          <w:tcPr>
+            <w:tcW w:w="0" w:type="auto"/>
+            <w:vAlign w:val="center"/>
+          </w:tcPr>
+          <w:p>
+            <w:pPr>
+              <w:spacing w:before="120" w:after="120"/>
+            </w:pPr>
+            <w:r>
+              <w:t>Conferma Accou</w:t>
+            </w:r>
+            <w:r>
+              <w:t>n</w:t>
+            </w:r>
+            <w:r>
+              <w:t>t</w:t>
+            </w:r>
+          </w:p>
+        </w:tc>
+        <w:tc>
+          <w:tcPr>
+            <w:tcW w:w="0" w:type="auto"/>
+            <w:vAlign w:val="center"/>
+          </w:tcPr>
+          <w:p>
+            <w:pPr>
+              <w:spacing w:before="120" w:after="120"/>
+            </w:pPr>
+            <w:r>
+              <w:t>Invia una mail di conferma all’utente dopo che si è registrato.</w:t>
+            </w:r>
+          </w:p>
+        </w:tc>
+        <w:tc>
+          <w:tcPr>
+            <w:tcW w:w="0" w:type="auto"/>
+            <w:vAlign w:val="center"/>
+          </w:tcPr>
+          <w:p>
+            <w:pPr>
+              <w:spacing w:before="120" w:after="120"/>
+            </w:pPr>
             <w:r>
               <w:t>Won’t</w:t>
             </w:r>
-            <w:proofErr w:type="spellEnd"/>
           </w:p>
         </w:tc>
         <w:tc>
@@ -1167,7 +1152,82 @@
               <w:spacing w:before="120" w:after="120"/>
             </w:pPr>
             <w:r>
-              <w:t>RF15</w:t>
+              <w:t>RF1</w:t>
+            </w:r>
+            <w:r>
+              <w:t>5</w:t>
+            </w:r>
+          </w:p>
+        </w:tc>
+        <w:tc>
+          <w:tcPr>
+            <w:tcW w:w="0" w:type="auto"/>
+            <w:vAlign w:val="center"/>
+          </w:tcPr>
+          <w:p>
+            <w:pPr>
+              <w:spacing w:before="120" w:after="120"/>
+            </w:pPr>
+            <w:r>
+              <w:t>Pagamento</w:t>
+            </w:r>
+          </w:p>
+        </w:tc>
+        <w:tc>
+          <w:tcPr>
+            <w:tcW w:w="0" w:type="auto"/>
+            <w:vAlign w:val="center"/>
+          </w:tcPr>
+          <w:p>
+            <w:pPr>
+              <w:spacing w:before="120" w:after="120"/>
+            </w:pPr>
+            <w:r>
+              <w:t>Permette il pagamento online del servizio.</w:t>
+            </w:r>
+          </w:p>
+        </w:tc>
+        <w:tc>
+          <w:tcPr>
+            <w:tcW w:w="0" w:type="auto"/>
+            <w:vAlign w:val="center"/>
+          </w:tcPr>
+          <w:p>
+            <w:pPr>
+              <w:spacing w:before="120" w:after="120"/>
+            </w:pPr>
+            <w:r>
+              <w:t>Won’t</w:t>
+            </w:r>
+          </w:p>
+        </w:tc>
+        <w:tc>
+          <w:tcPr>
+            <w:tcW w:w="0" w:type="auto"/>
+            <w:vAlign w:val="center"/>
+          </w:tcPr>
+          <w:p>
+            <w:pPr>
+              <w:spacing w:before="120" w:after="120"/>
+            </w:pPr>
+          </w:p>
+        </w:tc>
+      </w:tr>
+      <w:tr>
+        <w:tc>
+          <w:tcPr>
+            <w:tcW w:w="0" w:type="auto"/>
+            <w:vAlign w:val="center"/>
+          </w:tcPr>
+          <w:p>
+            <w:pPr>
+              <w:spacing w:before="120" w:after="120"/>
+            </w:pPr>
+            <w:r>
+              <w:t>RF1</w:t>
+            </w:r>
+            <w:r>
+              <w:t>6</w:t>
             </w:r>
           </w:p>
         </w:tc>
@@ -1208,11 +1268,9 @@
             <w:pPr>
               <w:spacing w:before="120" w:after="120"/>
             </w:pPr>
-            <w:proofErr w:type="spellStart"/>
             <w:r>
               <w:t>Won’t</w:t>
             </w:r>
-            <w:proofErr w:type="spellEnd"/>
           </w:p>
         </w:tc>
         <w:tc>
@@ -1356,18 +1414,7 @@
               <w:ind w:left="0"/>
             </w:pPr>
             <w:r>
-              <w:t xml:space="preserve">Il sistema deve rispondere entro </w:t>
-            </w:r>
-            <w:proofErr w:type="gramStart"/>
-            <w:r>
-              <w:t>3</w:t>
-            </w:r>
-            <w:proofErr w:type="gramEnd"/>
-            <w:r>
-              <w:t xml:space="preserve"> secondi per le principali operazioni</w:t>
-            </w:r>
-            <w:r>
-              <w:t>, così da non far attendere l’utente.</w:t>
+              <w:t>Il sistema deve rispondere entro 3 secondi per le principali operazioni, così da non far attendere l’utente.</w:t>
             </w:r>
           </w:p>
         </w:tc>
@@ -1413,15 +1460,7 @@
               <w:ind w:left="0"/>
             </w:pPr>
             <w:r>
-              <w:t xml:space="preserve">Il sistema deve essere in grado di poter essere modificato agevolmente senza </w:t>
-            </w:r>
-            <w:proofErr w:type="spellStart"/>
-            <w:r>
-              <w:t>downtime</w:t>
-            </w:r>
-            <w:proofErr w:type="spellEnd"/>
-            <w:r>
-              <w:t>.</w:t>
+              <w:t>Il sistema deve essere in grado di poter essere modificato agevolmente senza downtime.</w:t>
             </w:r>
           </w:p>
         </w:tc>
@@ -1621,13 +1660,7 @@
               <w:ind w:left="0"/>
             </w:pPr>
             <w:r>
-              <w:t>Il sistema deve prevenire</w:t>
-            </w:r>
-            <w:r>
-              <w:t xml:space="preserve"> la concorrenza tra utenti, quindi deve saper gestire</w:t>
-            </w:r>
-            <w:r>
-              <w:t xml:space="preserve"> doppie prenotazioni per la stessa colonnina.</w:t>
+              <w:t>Il sistema deve prevenire la concorrenza tra utenti, quindi deve saper gestire doppie prenotazioni per la stessa colonnina.</w:t>
             </w:r>
           </w:p>
         </w:tc>
@@ -1727,10 +1760,7 @@
               <w:ind w:left="0"/>
             </w:pPr>
             <w:r>
-              <w:t xml:space="preserve">Deve funzionare sui </w:t>
-            </w:r>
-            <w:r>
-              <w:t>principali browser.</w:t>
+              <w:t>Deve funzionare sui principali browser.</w:t>
             </w:r>
           </w:p>
         </w:tc>
@@ -1845,14 +1875,12 @@
         <w:lang w:val="fr-FR"/>
       </w:rPr>
     </w:pPr>
-    <w:proofErr w:type="spellStart"/>
     <w:r>
       <w:rPr>
         <w:lang w:val="fr-FR"/>
       </w:rPr>
       <w:t>Find&amp;Charge</w:t>
     </w:r>
-    <w:proofErr w:type="spellEnd"/>
     <w:r>
       <w:ptab w:relativeTo="margin" w:alignment="center" w:leader="none"/>
     </w:r>

</xml_diff>